<commit_message>
HMS-11: Repair project documents and align setup and evidence
</commit_message>
<xml_diff>
--- a/SAD_Hostel_Management_System.docx
+++ b/SAD_Hostel_Management_System.docx
@@ -803,7 +803,7 @@
       </w:tblGrid>
       <w:tr>
         <w:trPr>
-          <w:trHeight w:hRule="exact" w:val="368"/>
+          <w:trHeight w:hRule="atLeast" w:val="368"/>
         </w:trPr>
         <w:tc>
           <w:tcPr>
@@ -916,7 +916,7 @@
       </w:tr>
       <w:tr>
         <w:trPr>
-          <w:trHeight w:hRule="exact" w:val="404"/>
+          <w:trHeight w:hRule="atLeast" w:val="404"/>
         </w:trPr>
         <w:tc>
           <w:tcPr>
@@ -988,7 +988,7 @@
       </w:tr>
       <w:tr>
         <w:trPr>
-          <w:trHeight w:hRule="exact" w:val="404"/>
+          <w:trHeight w:hRule="atLeast" w:val="404"/>
         </w:trPr>
         <w:tc>
           <w:tcPr>
@@ -1079,7 +1079,7 @@
       </w:tr>
       <w:tr>
         <w:trPr>
-          <w:trHeight w:hRule="exact" w:val="402"/>
+          <w:trHeight w:hRule="atLeast" w:val="402"/>
         </w:trPr>
         <w:tc>
           <w:tcPr>
@@ -1634,7 +1634,7 @@
       </w:tblGrid>
       <w:tr>
         <w:trPr>
-          <w:trHeight w:hRule="exact" w:val="368"/>
+          <w:trHeight w:hRule="atLeast" w:val="368"/>
         </w:trPr>
         <w:tc>
           <w:tcPr>
@@ -1711,7 +1711,7 @@
       </w:tr>
       <w:tr>
         <w:trPr>
-          <w:trHeight w:hRule="exact" w:val="370"/>
+          <w:trHeight w:hRule="atLeast" w:val="370"/>
         </w:trPr>
         <w:tc>
           <w:tcPr>
@@ -1786,7 +1786,7 @@
       </w:tr>
       <w:tr>
         <w:trPr>
-          <w:trHeight w:hRule="exact" w:val="586"/>
+          <w:trHeight w:hRule="atLeast" w:val="586"/>
         </w:trPr>
         <w:tc>
           <w:tcPr>
@@ -1861,7 +1861,7 @@
       </w:tr>
       <w:tr>
         <w:trPr>
-          <w:trHeight w:hRule="exact" w:val="366"/>
+          <w:trHeight w:hRule="atLeast" w:val="366"/>
         </w:trPr>
         <w:tc>
           <w:tcPr>
@@ -1936,7 +1936,7 @@
       </w:tr>
       <w:tr>
         <w:trPr>
-          <w:trHeight w:hRule="exact" w:val="368"/>
+          <w:trHeight w:hRule="atLeast" w:val="368"/>
         </w:trPr>
         <w:tc>
           <w:tcPr>
@@ -2011,7 +2011,7 @@
       </w:tr>
       <w:tr>
         <w:trPr>
-          <w:trHeight w:hRule="exact" w:val="370"/>
+          <w:trHeight w:hRule="atLeast" w:val="370"/>
         </w:trPr>
         <w:tc>
           <w:tcPr>
@@ -2086,7 +2086,7 @@
       </w:tr>
       <w:tr>
         <w:trPr>
-          <w:trHeight w:hRule="exact" w:val="584"/>
+          <w:trHeight w:hRule="atLeast" w:val="584"/>
         </w:trPr>
         <w:tc>
           <w:tcPr>
@@ -2221,6 +2221,7 @@
     </w:p>
     <w:p>
       <w:pPr>
+        <w:keepNext/>
         <w:autoSpaceDN w:val="0"/>
         <w:autoSpaceDE w:val="0"/>
         <w:widowControl/>
@@ -2229,6 +2230,43 @@
         <w:jc w:val="center"/>
       </w:pPr>
       <w:r/>
+      <w:r>
+        <w:drawing>
+          <wp:inline xmlns:wp="http://schemas.openxmlformats.org/drawingml/2006/wordprocessingDrawing" distT="0" distB="0" distL="0" distR="0">
+            <wp:extent cx="5731510" cy="4684147"/>
+            <wp:effectExtent l="0" t="0" r="0" b="0"/>
+            <wp:docPr id="101" name="HMS_CD-01_Component_Diagram.png"/>
+            <wp:cNvGraphicFramePr>
+              <a:graphicFrameLocks xmlns:a="http://schemas.openxmlformats.org/drawingml/2006/main" noChangeAspect="1"/>
+            </wp:cNvGraphicFramePr>
+            <a:graphic xmlns:a="http://schemas.openxmlformats.org/drawingml/2006/main">
+              <a:graphicData uri="http://schemas.openxmlformats.org/drawingml/2006/picture">
+                <pic:pic xmlns:pic="http://schemas.openxmlformats.org/drawingml/2006/picture">
+                  <pic:nvPicPr>
+                    <pic:cNvPr id="0" name="HMS_CD-01_Component_Diagram.png"/>
+                    <pic:cNvPicPr/>
+                  </pic:nvPicPr>
+                  <pic:blipFill>
+                    <a:blip xmlns:r="http://schemas.openxmlformats.org/officeDocument/2006/relationships" r:embed="rId9"/>
+                    <a:stretch>
+                      <a:fillRect/>
+                    </a:stretch>
+                  </pic:blipFill>
+                  <pic:spPr>
+                    <a:xfrm>
+                      <a:off x="0" y="0"/>
+                      <a:ext cx="5731510" cy="4684147"/>
+                    </a:xfrm>
+                    <a:prstGeom prst="rect">
+                      <a:avLst/>
+                    </a:prstGeom>
+                  </pic:spPr>
+                </pic:pic>
+              </a:graphicData>
+            </a:graphic>
+          </wp:inline>
+        </w:drawing>
+      </w:r>
     </w:p>
     <w:p>
       <w:pPr>
@@ -2285,7 +2323,7 @@
       </w:tblGrid>
       <w:tr>
         <w:trPr>
-          <w:trHeight w:hRule="exact" w:val="358"/>
+          <w:trHeight w:hRule="atLeast" w:val="358"/>
         </w:trPr>
         <w:tc>
           <w:tcPr>
@@ -2434,7 +2472,7 @@
       </w:tr>
       <w:tr>
         <w:trPr>
-          <w:trHeight w:hRule="exact" w:val="768"/>
+          <w:trHeight w:hRule="atLeast" w:val="768"/>
         </w:trPr>
         <w:tc>
           <w:tcPr>
@@ -2579,7 +2617,7 @@
       </w:tr>
       <w:tr>
         <w:trPr>
-          <w:trHeight w:hRule="exact" w:val="980"/>
+          <w:trHeight w:hRule="atLeast" w:val="980"/>
         </w:trPr>
         <w:tc>
           <w:tcPr>
@@ -2750,7 +2788,7 @@
       </w:tr>
       <w:tr>
         <w:trPr>
-          <w:trHeight w:hRule="exact" w:val="562"/>
+          <w:trHeight w:hRule="atLeast" w:val="562"/>
         </w:trPr>
         <w:tc>
           <w:tcPr>
@@ -2895,7 +2933,7 @@
       </w:tr>
       <w:tr>
         <w:trPr>
-          <w:trHeight w:hRule="exact" w:val="564"/>
+          <w:trHeight w:hRule="atLeast" w:val="564"/>
         </w:trPr>
         <w:tc>
           <w:tcPr>
@@ -3040,7 +3078,7 @@
       </w:tr>
       <w:tr>
         <w:trPr>
-          <w:trHeight w:hRule="exact" w:val="774"/>
+          <w:trHeight w:hRule="atLeast" w:val="774"/>
         </w:trPr>
         <w:tc>
           <w:tcPr>
@@ -3185,7 +3223,7 @@
       </w:tr>
       <w:tr>
         <w:trPr>
-          <w:trHeight w:hRule="exact" w:val="562"/>
+          <w:trHeight w:hRule="atLeast" w:val="562"/>
         </w:trPr>
         <w:tc>
           <w:tcPr>
@@ -3330,7 +3368,7 @@
       </w:tr>
       <w:tr>
         <w:trPr>
-          <w:trHeight w:hRule="exact" w:val="358"/>
+          <w:trHeight w:hRule="atLeast" w:val="358"/>
         </w:trPr>
         <w:tc>
           <w:tcPr>
@@ -3475,7 +3513,7 @@
       </w:tr>
       <w:tr>
         <w:trPr>
-          <w:trHeight w:hRule="exact" w:val="772"/>
+          <w:trHeight w:hRule="atLeast" w:val="772"/>
         </w:trPr>
         <w:tc>
           <w:tcPr>
@@ -3633,7 +3671,7 @@
       </w:tr>
       <w:tr>
         <w:trPr>
-          <w:trHeight w:hRule="exact" w:val="564"/>
+          <w:trHeight w:hRule="atLeast" w:val="564"/>
         </w:trPr>
         <w:tc>
           <w:tcPr>
@@ -3831,7 +3869,7 @@
       </w:tblGrid>
       <w:tr>
         <w:trPr>
-          <w:trHeight w:hRule="exact" w:val="360"/>
+          <w:trHeight w:hRule="atLeast" w:val="360"/>
         </w:trPr>
         <w:tc>
           <w:tcPr>
@@ -3980,7 +4018,7 @@
       </w:tr>
       <w:tr>
         <w:trPr>
-          <w:trHeight w:hRule="exact" w:val="562"/>
+          <w:trHeight w:hRule="atLeast" w:val="562"/>
         </w:trPr>
         <w:tc>
           <w:tcPr>
@@ -4257,7 +4295,7 @@
       </w:tblGrid>
       <w:tr>
         <w:trPr>
-          <w:trHeight w:hRule="exact" w:val="370"/>
+          <w:trHeight w:hRule="atLeast" w:val="370"/>
         </w:trPr>
         <w:tc>
           <w:tcPr>
@@ -4334,7 +4372,7 @@
       </w:tr>
       <w:tr>
         <w:trPr>
-          <w:trHeight w:hRule="exact" w:val="368"/>
+          <w:trHeight w:hRule="atLeast" w:val="368"/>
         </w:trPr>
         <w:tc>
           <w:tcPr>
@@ -4409,7 +4447,7 @@
       </w:tr>
       <w:tr>
         <w:trPr>
-          <w:trHeight w:hRule="exact" w:val="368"/>
+          <w:trHeight w:hRule="atLeast" w:val="368"/>
         </w:trPr>
         <w:tc>
           <w:tcPr>
@@ -4484,7 +4522,7 @@
       </w:tr>
       <w:tr>
         <w:trPr>
-          <w:trHeight w:hRule="exact" w:val="366"/>
+          <w:trHeight w:hRule="atLeast" w:val="366"/>
         </w:trPr>
         <w:tc>
           <w:tcPr>
@@ -4559,7 +4597,7 @@
       </w:tr>
       <w:tr>
         <w:trPr>
-          <w:trHeight w:hRule="exact" w:val="368"/>
+          <w:trHeight w:hRule="atLeast" w:val="368"/>
         </w:trPr>
         <w:tc>
           <w:tcPr>
@@ -4634,7 +4672,7 @@
       </w:tr>
       <w:tr>
         <w:trPr>
-          <w:trHeight w:hRule="exact" w:val="588"/>
+          <w:trHeight w:hRule="atLeast" w:val="588"/>
         </w:trPr>
         <w:tc>
           <w:tcPr>
@@ -4709,7 +4747,7 @@
       </w:tr>
       <w:tr>
         <w:trPr>
-          <w:trHeight w:hRule="exact" w:val="584"/>
+          <w:trHeight w:hRule="atLeast" w:val="584"/>
         </w:trPr>
         <w:tc>
           <w:tcPr>
@@ -4784,7 +4822,7 @@
       </w:tr>
       <w:tr>
         <w:trPr>
-          <w:trHeight w:hRule="exact" w:val="368"/>
+          <w:trHeight w:hRule="atLeast" w:val="368"/>
         </w:trPr>
         <w:tc>
           <w:tcPr>
@@ -4891,7 +4929,7 @@
       </w:tblGrid>
       <w:tr>
         <w:trPr>
-          <w:trHeight w:hRule="exact" w:val="370"/>
+          <w:trHeight w:hRule="atLeast" w:val="370"/>
         </w:trPr>
         <w:tc>
           <w:tcPr>
@@ -4968,7 +5006,7 @@
       </w:tr>
       <w:tr>
         <w:trPr>
-          <w:trHeight w:hRule="exact" w:val="804"/>
+          <w:trHeight w:hRule="atLeast" w:val="804"/>
         </w:trPr>
         <w:tc>
           <w:tcPr>
@@ -5043,7 +5081,7 @@
       </w:tr>
       <w:tr>
         <w:trPr>
-          <w:trHeight w:hRule="exact" w:val="586"/>
+          <w:trHeight w:hRule="atLeast" w:val="586"/>
         </w:trPr>
         <w:tc>
           <w:tcPr>
@@ -5118,7 +5156,7 @@
       </w:tr>
       <w:tr>
         <w:trPr>
-          <w:trHeight w:hRule="exact" w:val="366"/>
+          <w:trHeight w:hRule="atLeast" w:val="366"/>
         </w:trPr>
         <w:tc>
           <w:tcPr>
@@ -5193,7 +5231,7 @@
       </w:tr>
       <w:tr>
         <w:trPr>
-          <w:trHeight w:hRule="exact" w:val="588"/>
+          <w:trHeight w:hRule="atLeast" w:val="588"/>
         </w:trPr>
         <w:tc>
           <w:tcPr>
@@ -5268,7 +5306,7 @@
       </w:tr>
       <w:tr>
         <w:trPr>
-          <w:trHeight w:hRule="exact" w:val="586"/>
+          <w:trHeight w:hRule="atLeast" w:val="586"/>
         </w:trPr>
         <w:tc>
           <w:tcPr>
@@ -5435,7 +5473,7 @@
       </w:tblGrid>
       <w:tr>
         <w:trPr>
-          <w:trHeight w:hRule="exact" w:val="360"/>
+          <w:trHeight w:hRule="atLeast" w:val="360"/>
         </w:trPr>
         <w:tc>
           <w:tcPr>
@@ -5548,7 +5586,7 @@
       </w:tr>
       <w:tr>
         <w:trPr>
-          <w:trHeight w:hRule="exact" w:val="354"/>
+          <w:trHeight w:hRule="atLeast" w:val="354"/>
         </w:trPr>
         <w:tc>
           <w:tcPr>
@@ -5658,7 +5696,7 @@
       </w:tr>
       <w:tr>
         <w:trPr>
-          <w:trHeight w:hRule="exact" w:val="358"/>
+          <w:trHeight w:hRule="atLeast" w:val="358"/>
         </w:trPr>
         <w:tc>
           <w:tcPr>
@@ -5768,7 +5806,7 @@
       </w:tr>
       <w:tr>
         <w:trPr>
-          <w:trHeight w:hRule="exact" w:val="356"/>
+          <w:trHeight w:hRule="atLeast" w:val="356"/>
         </w:trPr>
         <w:tc>
           <w:tcPr>
@@ -5878,7 +5916,7 @@
       </w:tr>
       <w:tr>
         <w:trPr>
-          <w:trHeight w:hRule="exact" w:val="360"/>
+          <w:trHeight w:hRule="atLeast" w:val="360"/>
         </w:trPr>
         <w:tc>
           <w:tcPr>
@@ -5988,7 +6026,7 @@
       </w:tr>
       <w:tr>
         <w:trPr>
-          <w:trHeight w:hRule="exact" w:val="356"/>
+          <w:trHeight w:hRule="atLeast" w:val="356"/>
         </w:trPr>
         <w:tc>
           <w:tcPr>
@@ -6098,7 +6136,7 @@
       </w:tr>
       <w:tr>
         <w:trPr>
-          <w:trHeight w:hRule="exact" w:val="356"/>
+          <w:trHeight w:hRule="atLeast" w:val="356"/>
         </w:trPr>
         <w:tc>
           <w:tcPr>
@@ -6208,7 +6246,7 @@
       </w:tr>
       <w:tr>
         <w:trPr>
-          <w:trHeight w:hRule="exact" w:val="358"/>
+          <w:trHeight w:hRule="atLeast" w:val="358"/>
         </w:trPr>
         <w:tc>
           <w:tcPr>
@@ -6318,7 +6356,7 @@
       </w:tr>
       <w:tr>
         <w:trPr>
-          <w:trHeight w:hRule="exact" w:val="356"/>
+          <w:trHeight w:hRule="atLeast" w:val="356"/>
         </w:trPr>
         <w:tc>
           <w:tcPr>
@@ -6428,7 +6466,7 @@
       </w:tr>
       <w:tr>
         <w:trPr>
-          <w:trHeight w:hRule="exact" w:val="358"/>
+          <w:trHeight w:hRule="atLeast" w:val="358"/>
         </w:trPr>
         <w:tc>
           <w:tcPr>
@@ -6538,7 +6576,7 @@
       </w:tr>
       <w:tr>
         <w:trPr>
-          <w:trHeight w:hRule="exact" w:val="356"/>
+          <w:trHeight w:hRule="atLeast" w:val="356"/>
         </w:trPr>
         <w:tc>
           <w:tcPr>
@@ -6648,7 +6686,7 @@
       </w:tr>
       <w:tr>
         <w:trPr>
-          <w:trHeight w:hRule="exact" w:val="358"/>
+          <w:trHeight w:hRule="atLeast" w:val="358"/>
         </w:trPr>
         <w:tc>
           <w:tcPr>
@@ -6758,7 +6796,7 @@
       </w:tr>
       <w:tr>
         <w:trPr>
-          <w:trHeight w:hRule="exact" w:val="358"/>
+          <w:trHeight w:hRule="atLeast" w:val="358"/>
         </w:trPr>
         <w:tc>
           <w:tcPr>
@@ -6868,7 +6906,7 @@
       </w:tr>
       <w:tr>
         <w:trPr>
-          <w:trHeight w:hRule="exact" w:val="354"/>
+          <w:trHeight w:hRule="atLeast" w:val="354"/>
         </w:trPr>
         <w:tc>
           <w:tcPr>
@@ -6978,7 +7016,7 @@
       </w:tr>
       <w:tr>
         <w:trPr>
-          <w:trHeight w:hRule="exact" w:val="358"/>
+          <w:trHeight w:hRule="atLeast" w:val="358"/>
         </w:trPr>
         <w:tc>
           <w:tcPr>
@@ -7088,7 +7126,7 @@
       </w:tr>
       <w:tr>
         <w:trPr>
-          <w:trHeight w:hRule="exact" w:val="358"/>
+          <w:trHeight w:hRule="atLeast" w:val="358"/>
         </w:trPr>
         <w:tc>
           <w:tcPr>
@@ -7198,7 +7236,7 @@
       </w:tr>
       <w:tr>
         <w:trPr>
-          <w:trHeight w:hRule="exact" w:val="358"/>
+          <w:trHeight w:hRule="atLeast" w:val="358"/>
         </w:trPr>
         <w:tc>
           <w:tcPr>
@@ -7308,7 +7346,7 @@
       </w:tr>
       <w:tr>
         <w:trPr>
-          <w:trHeight w:hRule="exact" w:val="354"/>
+          <w:trHeight w:hRule="atLeast" w:val="354"/>
         </w:trPr>
         <w:tc>
           <w:tcPr>
@@ -7418,7 +7456,7 @@
       </w:tr>
       <w:tr>
         <w:trPr>
-          <w:trHeight w:hRule="exact" w:val="360"/>
+          <w:trHeight w:hRule="atLeast" w:val="360"/>
         </w:trPr>
         <w:tc>
           <w:tcPr>
@@ -7528,7 +7566,7 @@
       </w:tr>
       <w:tr>
         <w:trPr>
-          <w:trHeight w:hRule="exact" w:val="354"/>
+          <w:trHeight w:hRule="atLeast" w:val="354"/>
         </w:trPr>
         <w:tc>
           <w:tcPr>
@@ -7638,7 +7676,7 @@
       </w:tr>
       <w:tr>
         <w:trPr>
-          <w:trHeight w:hRule="exact" w:val="358"/>
+          <w:trHeight w:hRule="atLeast" w:val="358"/>
         </w:trPr>
         <w:tc>
           <w:tcPr>
@@ -7748,7 +7786,7 @@
       </w:tr>
       <w:tr>
         <w:trPr>
-          <w:trHeight w:hRule="exact" w:val="358"/>
+          <w:trHeight w:hRule="atLeast" w:val="358"/>
         </w:trPr>
         <w:tc>
           <w:tcPr>
@@ -7858,7 +7896,7 @@
       </w:tr>
       <w:tr>
         <w:trPr>
-          <w:trHeight w:hRule="exact" w:val="358"/>
+          <w:trHeight w:hRule="atLeast" w:val="358"/>
         </w:trPr>
         <w:tc>
           <w:tcPr>
@@ -7968,7 +8006,7 @@
       </w:tr>
       <w:tr>
         <w:trPr>
-          <w:trHeight w:hRule="exact" w:val="354"/>
+          <w:trHeight w:hRule="atLeast" w:val="354"/>
         </w:trPr>
         <w:tc>
           <w:tcPr>
@@ -8078,7 +8116,7 @@
       </w:tr>
       <w:tr>
         <w:trPr>
-          <w:trHeight w:hRule="exact" w:val="358"/>
+          <w:trHeight w:hRule="atLeast" w:val="358"/>
         </w:trPr>
         <w:tc>
           <w:tcPr>
@@ -8188,7 +8226,7 @@
       </w:tr>
       <w:tr>
         <w:trPr>
-          <w:trHeight w:hRule="exact" w:val="356"/>
+          <w:trHeight w:hRule="atLeast" w:val="356"/>
         </w:trPr>
         <w:tc>
           <w:tcPr>
@@ -8298,7 +8336,7 @@
       </w:tr>
       <w:tr>
         <w:trPr>
-          <w:trHeight w:hRule="exact" w:val="358"/>
+          <w:trHeight w:hRule="atLeast" w:val="358"/>
         </w:trPr>
         <w:tc>
           <w:tcPr>
@@ -8408,7 +8446,7 @@
       </w:tr>
       <w:tr>
         <w:trPr>
-          <w:trHeight w:hRule="exact" w:val="356"/>
+          <w:trHeight w:hRule="atLeast" w:val="356"/>
         </w:trPr>
         <w:tc>
           <w:tcPr>
@@ -8518,7 +8556,7 @@
       </w:tr>
       <w:tr>
         <w:trPr>
-          <w:trHeight w:hRule="exact" w:val="360"/>
+          <w:trHeight w:hRule="atLeast" w:val="360"/>
         </w:trPr>
         <w:tc>
           <w:tcPr>
@@ -8628,7 +8666,7 @@
       </w:tr>
       <w:tr>
         <w:trPr>
-          <w:trHeight w:hRule="exact" w:val="356"/>
+          <w:trHeight w:hRule="atLeast" w:val="356"/>
         </w:trPr>
         <w:tc>
           <w:tcPr>
@@ -8738,7 +8776,7 @@
       </w:tr>
       <w:tr>
         <w:trPr>
-          <w:trHeight w:hRule="exact" w:val="358"/>
+          <w:trHeight w:hRule="atLeast" w:val="358"/>
         </w:trPr>
         <w:tc>
           <w:tcPr>
@@ -8848,7 +8886,7 @@
       </w:tr>
       <w:tr>
         <w:trPr>
-          <w:trHeight w:hRule="exact" w:val="356"/>
+          <w:trHeight w:hRule="atLeast" w:val="356"/>
         </w:trPr>
         <w:tc>
           <w:tcPr>
@@ -8958,7 +8996,7 @@
       </w:tr>
       <w:tr>
         <w:trPr>
-          <w:trHeight w:hRule="exact" w:val="356"/>
+          <w:trHeight w:hRule="atLeast" w:val="356"/>
         </w:trPr>
         <w:tc>
           <w:tcPr>
@@ -9068,7 +9106,7 @@
       </w:tr>
       <w:tr>
         <w:trPr>
-          <w:trHeight w:hRule="exact" w:val="358"/>
+          <w:trHeight w:hRule="atLeast" w:val="358"/>
         </w:trPr>
         <w:tc>
           <w:tcPr>
@@ -9178,7 +9216,7 @@
       </w:tr>
       <w:tr>
         <w:trPr>
-          <w:trHeight w:hRule="exact" w:val="356"/>
+          <w:trHeight w:hRule="atLeast" w:val="356"/>
         </w:trPr>
         <w:tc>
           <w:tcPr>
@@ -9288,7 +9326,7 @@
       </w:tr>
       <w:tr>
         <w:trPr>
-          <w:trHeight w:hRule="exact" w:val="356"/>
+          <w:trHeight w:hRule="atLeast" w:val="356"/>
         </w:trPr>
         <w:tc>
           <w:tcPr>
@@ -9398,7 +9436,7 @@
       </w:tr>
       <w:tr>
         <w:trPr>
-          <w:trHeight w:hRule="exact" w:val="360"/>
+          <w:trHeight w:hRule="atLeast" w:val="360"/>
         </w:trPr>
         <w:tc>
           <w:tcPr>
@@ -9630,7 +9668,7 @@
       </w:tblGrid>
       <w:tr>
         <w:trPr>
-          <w:trHeight w:hRule="exact" w:val="356"/>
+          <w:trHeight w:hRule="atLeast" w:val="356"/>
         </w:trPr>
         <w:tc>
           <w:tcPr>
@@ -9743,7 +9781,7 @@
       </w:tr>
       <w:tr>
         <w:trPr>
-          <w:trHeight w:hRule="exact" w:val="770"/>
+          <w:trHeight w:hRule="atLeast" w:val="770"/>
         </w:trPr>
         <w:tc>
           <w:tcPr>
@@ -9853,7 +9891,7 @@
       </w:tr>
       <w:tr>
         <w:trPr>
-          <w:trHeight w:hRule="exact" w:val="774"/>
+          <w:trHeight w:hRule="atLeast" w:val="774"/>
         </w:trPr>
         <w:tc>
           <w:tcPr>
@@ -9963,7 +10001,7 @@
       </w:tr>
       <w:tr>
         <w:trPr>
-          <w:trHeight w:hRule="exact" w:val="562"/>
+          <w:trHeight w:hRule="atLeast" w:val="562"/>
         </w:trPr>
         <w:tc>
           <w:tcPr>
@@ -10073,7 +10111,7 @@
       </w:tr>
       <w:tr>
         <w:trPr>
-          <w:trHeight w:hRule="exact" w:val="772"/>
+          <w:trHeight w:hRule="atLeast" w:val="772"/>
         </w:trPr>
         <w:tc>
           <w:tcPr>
@@ -10183,7 +10221,7 @@
       </w:tr>
       <w:tr>
         <w:trPr>
-          <w:trHeight w:hRule="exact" w:val="564"/>
+          <w:trHeight w:hRule="atLeast" w:val="564"/>
         </w:trPr>
         <w:tc>
           <w:tcPr>
@@ -10293,7 +10331,7 @@
       </w:tr>
       <w:tr>
         <w:trPr>
-          <w:trHeight w:hRule="exact" w:val="770"/>
+          <w:trHeight w:hRule="atLeast" w:val="770"/>
         </w:trPr>
         <w:tc>
           <w:tcPr>
@@ -10804,7 +10842,7 @@
       </w:tblGrid>
       <w:tr>
         <w:trPr>
-          <w:trHeight w:hRule="exact" w:val="356"/>
+          <w:trHeight w:hRule="atLeast" w:val="356"/>
         </w:trPr>
         <w:tc>
           <w:tcPr>
@@ -10917,7 +10955,7 @@
       </w:tr>
       <w:tr>
         <w:trPr>
-          <w:trHeight w:hRule="exact" w:val="564"/>
+          <w:trHeight w:hRule="atLeast" w:val="564"/>
         </w:trPr>
         <w:tc>
           <w:tcPr>
@@ -11079,7 +11117,7 @@
       </w:tblGrid>
       <w:tr>
         <w:trPr>
-          <w:trHeight w:hRule="exact" w:val="360"/>
+          <w:trHeight w:hRule="atLeast" w:val="360"/>
         </w:trPr>
         <w:tc>
           <w:tcPr>
@@ -11192,7 +11230,7 @@
       </w:tr>
       <w:tr>
         <w:trPr>
-          <w:trHeight w:hRule="exact" w:val="562"/>
+          <w:trHeight w:hRule="atLeast" w:val="562"/>
         </w:trPr>
         <w:tc>
           <w:tcPr>
@@ -11302,7 +11340,7 @@
       </w:tr>
       <w:tr>
         <w:trPr>
-          <w:trHeight w:hRule="exact" w:val="358"/>
+          <w:trHeight w:hRule="atLeast" w:val="358"/>
         </w:trPr>
         <w:tc>
           <w:tcPr>
@@ -11412,7 +11450,7 @@
       </w:tr>
       <w:tr>
         <w:trPr>
-          <w:trHeight w:hRule="exact" w:val="564"/>
+          <w:trHeight w:hRule="atLeast" w:val="564"/>
         </w:trPr>
         <w:tc>
           <w:tcPr>
@@ -11522,7 +11560,7 @@
       </w:tr>
       <w:tr>
         <w:trPr>
-          <w:trHeight w:hRule="exact" w:val="564"/>
+          <w:trHeight w:hRule="atLeast" w:val="564"/>
         </w:trPr>
         <w:tc>
           <w:tcPr>
@@ -11645,7 +11683,7 @@
       </w:tr>
       <w:tr>
         <w:trPr>
-          <w:trHeight w:hRule="exact" w:val="770"/>
+          <w:trHeight w:hRule="atLeast" w:val="770"/>
         </w:trPr>
         <w:tc>
           <w:tcPr>
@@ -11768,7 +11806,7 @@
       </w:tr>
       <w:tr>
         <w:trPr>
-          <w:trHeight w:hRule="exact" w:val="566"/>
+          <w:trHeight w:hRule="atLeast" w:val="566"/>
         </w:trPr>
         <w:tc>
           <w:tcPr>
@@ -11878,7 +11916,7 @@
       </w:tr>
       <w:tr>
         <w:trPr>
-          <w:trHeight w:hRule="exact" w:val="354"/>
+          <w:trHeight w:hRule="atLeast" w:val="354"/>
         </w:trPr>
         <w:tc>
           <w:tcPr>
@@ -12082,6 +12120,7 @@
     </w:p>
     <w:p>
       <w:pPr>
+        <w:keepNext/>
         <w:autoSpaceDN w:val="0"/>
         <w:autoSpaceDE w:val="0"/>
         <w:widowControl/>
@@ -12090,6 +12129,43 @@
         <w:jc w:val="center"/>
       </w:pPr>
       <w:r/>
+      <w:r>
+        <w:drawing>
+          <wp:inline xmlns:wp="http://schemas.openxmlformats.org/drawingml/2006/wordprocessingDrawing" distT="0" distB="0" distL="0" distR="0">
+            <wp:extent cx="5731510" cy="4209220"/>
+            <wp:effectExtent l="0" t="0" r="0" b="0"/>
+            <wp:docPr id="102" name="HMS_SD-01_Student_Registration.png"/>
+            <wp:cNvGraphicFramePr>
+              <a:graphicFrameLocks xmlns:a="http://schemas.openxmlformats.org/drawingml/2006/main" noChangeAspect="1"/>
+            </wp:cNvGraphicFramePr>
+            <a:graphic xmlns:a="http://schemas.openxmlformats.org/drawingml/2006/main">
+              <a:graphicData uri="http://schemas.openxmlformats.org/drawingml/2006/picture">
+                <pic:pic xmlns:pic="http://schemas.openxmlformats.org/drawingml/2006/picture">
+                  <pic:nvPicPr>
+                    <pic:cNvPr id="0" name="HMS_SD-01_Student_Registration.png"/>
+                    <pic:cNvPicPr/>
+                  </pic:nvPicPr>
+                  <pic:blipFill>
+                    <a:blip xmlns:r="http://schemas.openxmlformats.org/officeDocument/2006/relationships" r:embed="rId10"/>
+                    <a:stretch>
+                      <a:fillRect/>
+                    </a:stretch>
+                  </pic:blipFill>
+                  <pic:spPr>
+                    <a:xfrm>
+                      <a:off x="0" y="0"/>
+                      <a:ext cx="5731510" cy="4209220"/>
+                    </a:xfrm>
+                    <a:prstGeom prst="rect">
+                      <a:avLst/>
+                    </a:prstGeom>
+                  </pic:spPr>
+                </pic:pic>
+              </a:graphicData>
+            </a:graphic>
+          </wp:inline>
+        </w:drawing>
+      </w:r>
     </w:p>
     <w:p>
       <w:pPr>
@@ -12152,6 +12228,7 @@
     </w:p>
     <w:p>
       <w:pPr>
+        <w:keepNext/>
         <w:autoSpaceDN w:val="0"/>
         <w:autoSpaceDE w:val="0"/>
         <w:widowControl/>
@@ -12160,6 +12237,43 @@
         <w:jc w:val="center"/>
       </w:pPr>
       <w:r/>
+      <w:r>
+        <w:drawing>
+          <wp:inline xmlns:wp="http://schemas.openxmlformats.org/drawingml/2006/wordprocessingDrawing" distT="0" distB="0" distL="0" distR="0">
+            <wp:extent cx="5731510" cy="4383458"/>
+            <wp:effectExtent l="0" t="0" r="0" b="0"/>
+            <wp:docPr id="103" name="HMS_SD-02_Bed_Allocation.png"/>
+            <wp:cNvGraphicFramePr>
+              <a:graphicFrameLocks xmlns:a="http://schemas.openxmlformats.org/drawingml/2006/main" noChangeAspect="1"/>
+            </wp:cNvGraphicFramePr>
+            <a:graphic xmlns:a="http://schemas.openxmlformats.org/drawingml/2006/main">
+              <a:graphicData uri="http://schemas.openxmlformats.org/drawingml/2006/picture">
+                <pic:pic xmlns:pic="http://schemas.openxmlformats.org/drawingml/2006/picture">
+                  <pic:nvPicPr>
+                    <pic:cNvPr id="0" name="HMS_SD-02_Bed_Allocation.png"/>
+                    <pic:cNvPicPr/>
+                  </pic:nvPicPr>
+                  <pic:blipFill>
+                    <a:blip xmlns:r="http://schemas.openxmlformats.org/officeDocument/2006/relationships" r:embed="rId11"/>
+                    <a:stretch>
+                      <a:fillRect/>
+                    </a:stretch>
+                  </pic:blipFill>
+                  <pic:spPr>
+                    <a:xfrm>
+                      <a:off x="0" y="0"/>
+                      <a:ext cx="5731510" cy="4383458"/>
+                    </a:xfrm>
+                    <a:prstGeom prst="rect">
+                      <a:avLst/>
+                    </a:prstGeom>
+                  </pic:spPr>
+                </pic:pic>
+              </a:graphicData>
+            </a:graphic>
+          </wp:inline>
+        </w:drawing>
+      </w:r>
     </w:p>
     <w:p>
       <w:pPr>
@@ -12258,7 +12372,7 @@
       </w:tblGrid>
       <w:tr>
         <w:trPr>
-          <w:trHeight w:hRule="exact" w:val="324"/>
+          <w:trHeight w:hRule="atLeast" w:val="324"/>
         </w:trPr>
         <w:tc>
           <w:tcPr>
@@ -12479,7 +12593,7 @@
       </w:tr>
       <w:tr>
         <w:trPr>
-          <w:trHeight w:hRule="exact" w:val="666"/>
+          <w:trHeight w:hRule="atLeast" w:val="666"/>
         </w:trPr>
         <w:tc>
           <w:tcPr>
@@ -12707,7 +12821,7 @@
       </w:tr>
       <w:tr>
         <w:trPr>
-          <w:trHeight w:hRule="exact" w:val="324"/>
+          <w:trHeight w:hRule="atLeast" w:val="324"/>
         </w:trPr>
         <w:tc>
           <w:tcPr>
@@ -12922,7 +13036,7 @@
       </w:tr>
       <w:tr>
         <w:trPr>
-          <w:trHeight w:hRule="exact" w:val="670"/>
+          <w:trHeight w:hRule="atLeast" w:val="670"/>
         </w:trPr>
         <w:tc>
           <w:tcPr>
@@ -13186,7 +13300,7 @@
       </w:tblGrid>
       <w:tr>
         <w:trPr>
-          <w:trHeight w:hRule="exact" w:val="324"/>
+          <w:trHeight w:hRule="atLeast" w:val="324"/>
         </w:trPr>
         <w:tc>
           <w:tcPr>
@@ -13407,7 +13521,7 @@
       </w:tr>
       <w:tr>
         <w:trPr>
-          <w:trHeight w:hRule="exact" w:val="842"/>
+          <w:trHeight w:hRule="atLeast" w:val="842"/>
         </w:trPr>
         <w:tc>
           <w:tcPr>
@@ -13661,7 +13775,7 @@
       </w:tr>
       <w:tr>
         <w:trPr>
-          <w:trHeight w:hRule="exact" w:val="494"/>
+          <w:trHeight w:hRule="atLeast" w:val="494"/>
         </w:trPr>
         <w:tc>
           <w:tcPr>
@@ -13951,7 +14065,7 @@
       </w:tblGrid>
       <w:tr>
         <w:trPr>
-          <w:trHeight w:hRule="exact" w:val="324"/>
+          <w:trHeight w:hRule="atLeast" w:val="324"/>
         </w:trPr>
         <w:tc>
           <w:tcPr>
@@ -14172,7 +14286,7 @@
       </w:tr>
       <w:tr>
         <w:trPr>
-          <w:trHeight w:hRule="exact" w:val="668"/>
+          <w:trHeight w:hRule="atLeast" w:val="668"/>
         </w:trPr>
         <w:tc>
           <w:tcPr>
@@ -14387,7 +14501,7 @@
       </w:tr>
       <w:tr>
         <w:trPr>
-          <w:trHeight w:hRule="exact" w:val="672"/>
+          <w:trHeight w:hRule="atLeast" w:val="672"/>
         </w:trPr>
         <w:tc>
           <w:tcPr>
@@ -14615,7 +14729,7 @@
       </w:tr>
       <w:tr>
         <w:trPr>
-          <w:trHeight w:hRule="exact" w:val="494"/>
+          <w:trHeight w:hRule="atLeast" w:val="494"/>
         </w:trPr>
         <w:tc>
           <w:tcPr>
@@ -14866,7 +14980,7 @@
       </w:tblGrid>
       <w:tr>
         <w:trPr>
-          <w:trHeight w:hRule="exact" w:val="324"/>
+          <w:trHeight w:hRule="atLeast" w:val="324"/>
         </w:trPr>
         <w:tc>
           <w:tcPr>
@@ -15087,7 +15201,7 @@
       </w:tr>
       <w:tr>
         <w:trPr>
-          <w:trHeight w:hRule="exact" w:val="496"/>
+          <w:trHeight w:hRule="atLeast" w:val="496"/>
         </w:trPr>
         <w:tc>
           <w:tcPr>
@@ -15315,7 +15429,7 @@
       </w:tr>
       <w:tr>
         <w:trPr>
-          <w:trHeight w:hRule="exact" w:val="670"/>
+          <w:trHeight w:hRule="atLeast" w:val="670"/>
         </w:trPr>
         <w:tc>
           <w:tcPr>
@@ -15543,7 +15657,7 @@
       </w:tr>
       <w:tr>
         <w:trPr>
-          <w:trHeight w:hRule="exact" w:val="668"/>
+          <w:trHeight w:hRule="atLeast" w:val="668"/>
         </w:trPr>
         <w:tc>
           <w:tcPr>
@@ -15814,7 +15928,7 @@
       </w:tblGrid>
       <w:tr>
         <w:trPr>
-          <w:trHeight w:hRule="exact" w:val="326"/>
+          <w:trHeight w:hRule="atLeast" w:val="326"/>
         </w:trPr>
         <w:tc>
           <w:tcPr>
@@ -16035,7 +16149,7 @@
       </w:tr>
       <w:tr>
         <w:trPr>
-          <w:trHeight w:hRule="exact" w:val="1186"/>
+          <w:trHeight w:hRule="atLeast" w:val="1186"/>
         </w:trPr>
         <w:tc>
           <w:tcPr>
@@ -16276,7 +16390,7 @@
       </w:tr>
       <w:tr>
         <w:trPr>
-          <w:trHeight w:hRule="exact" w:val="668"/>
+          <w:trHeight w:hRule="atLeast" w:val="668"/>
         </w:trPr>
         <w:tc>
           <w:tcPr>
@@ -16491,7 +16605,7 @@
       </w:tr>
       <w:tr>
         <w:trPr>
-          <w:trHeight w:hRule="exact" w:val="670"/>
+          <w:trHeight w:hRule="atLeast" w:val="670"/>
         </w:trPr>
         <w:tc>
           <w:tcPr>
@@ -16719,7 +16833,7 @@
       </w:tr>
       <w:tr>
         <w:trPr>
-          <w:trHeight w:hRule="exact" w:val="322"/>
+          <w:trHeight w:hRule="atLeast" w:val="322"/>
         </w:trPr>
         <w:tc>
           <w:tcPr>
@@ -16970,7 +17084,7 @@
       </w:tblGrid>
       <w:tr>
         <w:trPr>
-          <w:trHeight w:hRule="exact" w:val="324"/>
+          <w:trHeight w:hRule="atLeast" w:val="324"/>
         </w:trPr>
         <w:tc>
           <w:tcPr>
@@ -17191,7 +17305,7 @@
       </w:tr>
       <w:tr>
         <w:trPr>
-          <w:trHeight w:hRule="exact" w:val="666"/>
+          <w:trHeight w:hRule="atLeast" w:val="666"/>
         </w:trPr>
         <w:tc>
           <w:tcPr>
@@ -17419,7 +17533,7 @@
       </w:tr>
       <w:tr>
         <w:trPr>
-          <w:trHeight w:hRule="exact" w:val="496"/>
+          <w:trHeight w:hRule="atLeast" w:val="496"/>
         </w:trPr>
         <w:tc>
           <w:tcPr>
@@ -17634,7 +17748,7 @@
       </w:tr>
       <w:tr>
         <w:trPr>
-          <w:trHeight w:hRule="exact" w:val="670"/>
+          <w:trHeight w:hRule="atLeast" w:val="670"/>
         </w:trPr>
         <w:tc>
           <w:tcPr>
@@ -17862,7 +17976,7 @@
       </w:tr>
       <w:tr>
         <w:trPr>
-          <w:trHeight w:hRule="exact" w:val="498"/>
+          <w:trHeight w:hRule="atLeast" w:val="498"/>
         </w:trPr>
         <w:tc>
           <w:tcPr>
@@ -18148,7 +18262,7 @@
       </w:tblGrid>
       <w:tr>
         <w:trPr>
-          <w:trHeight w:hRule="exact" w:val="348"/>
+          <w:trHeight w:hRule="atLeast" w:val="348"/>
         </w:trPr>
         <w:tc>
           <w:tcPr>
@@ -18225,7 +18339,7 @@
       </w:tr>
       <w:tr>
         <w:trPr>
-          <w:trHeight w:hRule="exact" w:val="1660"/>
+          <w:trHeight w:hRule="atLeast" w:val="1660"/>
         </w:trPr>
         <w:tc>
           <w:tcPr>
@@ -18483,7 +18597,7 @@
       </w:tblGrid>
       <w:tr>
         <w:trPr>
-          <w:trHeight w:hRule="exact" w:val="346"/>
+          <w:trHeight w:hRule="atLeast" w:val="346"/>
         </w:trPr>
         <w:tc>
           <w:tcPr>
@@ -18632,7 +18746,7 @@
       </w:tr>
       <w:tr>
         <w:trPr>
-          <w:trHeight w:hRule="exact" w:val="346"/>
+          <w:trHeight w:hRule="atLeast" w:val="346"/>
         </w:trPr>
         <w:tc>
           <w:tcPr>
@@ -18777,7 +18891,7 @@
       </w:tr>
       <w:tr>
         <w:trPr>
-          <w:trHeight w:hRule="exact" w:val="542"/>
+          <w:trHeight w:hRule="atLeast" w:val="542"/>
         </w:trPr>
         <w:tc>
           <w:tcPr>
@@ -18935,7 +19049,7 @@
       </w:tr>
       <w:tr>
         <w:trPr>
-          <w:trHeight w:hRule="exact" w:val="544"/>
+          <w:trHeight w:hRule="atLeast" w:val="544"/>
         </w:trPr>
         <w:tc>
           <w:tcPr>
@@ -19080,7 +19194,7 @@
       </w:tr>
       <w:tr>
         <w:trPr>
-          <w:trHeight w:hRule="exact" w:val="344"/>
+          <w:trHeight w:hRule="atLeast" w:val="344"/>
         </w:trPr>
         <w:tc>
           <w:tcPr>
@@ -19225,7 +19339,7 @@
       </w:tr>
       <w:tr>
         <w:trPr>
-          <w:trHeight w:hRule="exact" w:val="1130"/>
+          <w:trHeight w:hRule="atLeast" w:val="1130"/>
         </w:trPr>
         <w:tc>
           <w:tcPr>
@@ -19396,7 +19510,7 @@
       </w:tr>
       <w:tr>
         <w:trPr>
-          <w:trHeight w:hRule="exact" w:val="542"/>
+          <w:trHeight w:hRule="atLeast" w:val="542"/>
         </w:trPr>
         <w:tc>
           <w:tcPr>
@@ -19541,7 +19655,7 @@
       </w:tr>
       <w:tr>
         <w:trPr>
-          <w:trHeight w:hRule="exact" w:val="348"/>
+          <w:trHeight w:hRule="atLeast" w:val="348"/>
         </w:trPr>
         <w:tc>
           <w:tcPr>
@@ -19686,7 +19800,7 @@
       </w:tr>
       <w:tr>
         <w:trPr>
-          <w:trHeight w:hRule="exact" w:val="738"/>
+          <w:trHeight w:hRule="atLeast" w:val="738"/>
         </w:trPr>
         <w:tc>
           <w:tcPr>
@@ -19852,7 +19966,7 @@
       </w:tblGrid>
       <w:tr>
         <w:trPr>
-          <w:trHeight w:hRule="exact" w:val="308"/>
+          <w:trHeight w:hRule="atLeast" w:val="308"/>
         </w:trPr>
         <w:tc>
           <w:tcPr>

</xml_diff>